<commit_message>
Reject engine vibration in motion detection
</commit_message>
<xml_diff>
--- a/docs/generated/Gym_Ana_System_Design.docx
+++ b/docs/generated/Gym_Ana_System_Design.docx
@@ -4182,6 +4182,37 @@
         <w:pStyle w:val="Heading2"/>
       </w:pPr>
       <w:r>
+        <w:t>エンジン振動除去</w:t>
+      </w:r>
+    </w:p>
+    <w:p>
+      <w:r>
+        <w:t>補正済み3軸加速度は、車体軸決定、イベント判定、速度積分の前に時定数0.08秒の一次低域通過フィルタへ通す。自動STARTは前後Gがしきい値を140 ms継続した場合に成立させ、開始時刻は継続判定の先頭へ戻す。静止補正はSTART待機時と同じエンジンアイドリング状態で行う。</w:t>
+      </w:r>
+    </w:p>
+    <w:p>
+      <w:pPr>
+        <w:spacing w:before="80" w:after="160"/>
+        <w:ind w:left="403" w:right="403"/>
+        <w:shd w:fill="F4F6F7"/>
+      </w:pPr>
+      <w:r>
+        <w:rPr>
+          <w:rFonts w:ascii="Consolas" w:hAnsi="Consolas"/>
+          <w:sz w:val="18"/>
+        </w:rPr>
+        <w:t>alpha = 1 - exp(-dt / 0.08)</w:t>
+        <w:br/>
+        <w:t>a_lp = a_lp + alpha * (a_c - a_lp)</w:t>
+        <w:br/>
+        <w:t>vibration = a_c - a_lp</w:t>
+      </w:r>
+    </w:p>
+    <w:p>
+      <w:pPr>
+        <w:pStyle w:val="Heading2"/>
+      </w:pPr>
+      <w:r>
         <w:t>車体座標</w:t>
       </w:r>
     </w:p>
@@ -6151,7 +6182,7 @@
               <w:rPr>
                 <w:sz w:val="17"/>
               </w:rPr>
-              <w:t>variance</w:t>
+              <w:t>vibrationG</w:t>
             </w:r>
           </w:p>
         </w:tc>
@@ -6183,6 +6214,102 @@
               <w:rPr>
                 <w:sz w:val="17"/>
               </w:rPr>
+              <w:t>G</w:t>
+            </w:r>
+          </w:p>
+        </w:tc>
+        <w:tc>
+          <w:tcPr>
+            <w:tcW w:type="dxa" w:w="5112"/>
+            <w:tcBorders>
+              <w:top w:val="single" w:sz="6" w:color="D9D9D9"/>
+              <w:left w:val="single" w:sz="6" w:color="D9D9D9"/>
+              <w:bottom w:val="single" w:sz="6" w:color="D9D9D9"/>
+              <w:right w:val="single" w:sz="6" w:color="D9D9D9"/>
+              <w:insideH w:val="single" w:sz="6" w:color="D9D9D9"/>
+              <w:insideV w:val="single" w:sz="6" w:color="D9D9D9"/>
+            </w:tcBorders>
+            <w:tcMar>
+              <w:top w:w="100" w:type="dxa"/>
+              <w:start w:w="120" w:type="dxa"/>
+              <w:bottom w:w="100" w:type="dxa"/>
+              <w:end w:w="120" w:type="dxa"/>
+            </w:tcMar>
+            <w:vAlign w:val="center"/>
+            <w:shd w:fill="F4F6F7"/>
+          </w:tcPr>
+          <w:p>
+            <w:pPr>
+              <w:jc w:val="left"/>
+            </w:pPr>
+            <w:r>
+              <w:rPr>
+                <w:sz w:val="17"/>
+              </w:rPr>
+              <w:t>除去した高周波振動のRMS</w:t>
+            </w:r>
+          </w:p>
+        </w:tc>
+      </w:tr>
+      <w:tr>
+        <w:tc>
+          <w:tcPr>
+            <w:tcW w:type="dxa" w:w="2880"/>
+            <w:tcBorders>
+              <w:top w:val="single" w:sz="6" w:color="D9D9D9"/>
+              <w:left w:val="single" w:sz="6" w:color="D9D9D9"/>
+              <w:bottom w:val="single" w:sz="6" w:color="D9D9D9"/>
+              <w:right w:val="single" w:sz="6" w:color="D9D9D9"/>
+              <w:insideH w:val="single" w:sz="6" w:color="D9D9D9"/>
+              <w:insideV w:val="single" w:sz="6" w:color="D9D9D9"/>
+            </w:tcBorders>
+            <w:tcMar>
+              <w:top w:w="100" w:type="dxa"/>
+              <w:start w:w="120" w:type="dxa"/>
+              <w:bottom w:w="100" w:type="dxa"/>
+              <w:end w:w="120" w:type="dxa"/>
+            </w:tcMar>
+            <w:vAlign w:val="center"/>
+          </w:tcPr>
+          <w:p>
+            <w:pPr>
+              <w:jc w:val="center"/>
+            </w:pPr>
+            <w:r>
+              <w:rPr>
+                <w:sz w:val="17"/>
+              </w:rPr>
+              <w:t>variance</w:t>
+            </w:r>
+          </w:p>
+        </w:tc>
+        <w:tc>
+          <w:tcPr>
+            <w:tcW w:type="dxa" w:w="1656"/>
+            <w:tcBorders>
+              <w:top w:val="single" w:sz="6" w:color="D9D9D9"/>
+              <w:left w:val="single" w:sz="6" w:color="D9D9D9"/>
+              <w:bottom w:val="single" w:sz="6" w:color="D9D9D9"/>
+              <w:right w:val="single" w:sz="6" w:color="D9D9D9"/>
+              <w:insideH w:val="single" w:sz="6" w:color="D9D9D9"/>
+              <w:insideV w:val="single" w:sz="6" w:color="D9D9D9"/>
+            </w:tcBorders>
+            <w:tcMar>
+              <w:top w:w="100" w:type="dxa"/>
+              <w:start w:w="120" w:type="dxa"/>
+              <w:bottom w:w="100" w:type="dxa"/>
+              <w:end w:w="120" w:type="dxa"/>
+            </w:tcMar>
+            <w:vAlign w:val="center"/>
+          </w:tcPr>
+          <w:p>
+            <w:pPr>
+              <w:jc w:val="left"/>
+            </w:pPr>
+            <w:r>
+              <w:rPr>
+                <w:sz w:val="17"/>
+              </w:rPr>
               <w:t>各状態</w:t>
             </w:r>
           </w:p>
@@ -6205,7 +6332,6 @@
               <w:end w:w="120" w:type="dxa"/>
             </w:tcMar>
             <w:vAlign w:val="center"/>
-            <w:shd w:fill="F4F6F7"/>
           </w:tcPr>
           <w:p>
             <w:pPr>
@@ -6267,7 +6393,7 @@
         <w:spacing w:after="60"/>
       </w:pPr>
       <w:r>
-        <w:t>Service Workerはmoto-gym-ana-v10としてアプリシェルをキャッシュする。</w:t>
+        <w:t>Service Workerはmoto-gym-ana-v11としてアプリシェルをキャッシュする。</w:t>
       </w:r>
     </w:p>
     <w:p>

</xml_diff>

<commit_message>
Fix speed response and motion state detection
</commit_message>
<xml_diff>
--- a/docs/generated/Gym_Ana_System_Design.docx
+++ b/docs/generated/Gym_Ana_System_Design.docx
@@ -1586,7 +1586,7 @@
               <w:rPr>
                 <w:sz w:val="18"/>
               </w:rPr>
-              <w:t>Sensor ON後に4秒の静止キャリブレーションを実行する</w:t>
+              <w:t>Calibration操作で4秒補正を開始し成功または失敗理由を表示する</w:t>
             </w:r>
           </w:p>
         </w:tc>
@@ -1652,7 +1652,7 @@
               <w:rPr>
                 <w:sz w:val="18"/>
               </w:rPr>
-              <w:t>Auto ONとOFFで自動計測を切り替える</w:t>
+              <w:t>Auto待機とAuto解除で自動発進待ちを制御する</w:t>
             </w:r>
           </w:p>
         </w:tc>
@@ -1716,7 +1716,7 @@
               <w:rPr>
                 <w:sz w:val="18"/>
               </w:rPr>
-              <w:t>Manual ONとOFFで手動計測を開始および停止する</w:t>
+              <w:t>手動開始と計測停止で計測を明示的に制御する</w:t>
             </w:r>
           </w:p>
         </w:tc>
@@ -2593,7 +2593,7 @@
     </w:p>
     <w:p>
       <w:r>
-        <w:t>Auto ONは発進待ちを作る。最初の明確な水平加速で車体前方向を確定し、前後Gが感度しきい値を超えるとSTARTする。START処理は速度状態を0へ戻してから時系列記録を始める。</w:t>
+        <w:t>Auto待機は発進待ちを作る。最初の明確な水平加速で車体前方向を確定し、前後Gが感度しきい値を140 ms継続して超えるとSTARTする。手動開始は操作時刻から直ちに計測する。計測停止はどちらの方式でも走行を終了して保存する。</w:t>
       </w:r>
     </w:p>
     <w:p>
@@ -2867,7 +2867,7 @@
               <w:rPr>
                 <w:sz w:val="17"/>
               </w:rPr>
-              <w:t>Sensor ONでcalibrating</w:t>
+              <w:t>Sensor ONでsensor-on</w:t>
             </w:r>
           </w:p>
         </w:tc>
@@ -2933,7 +2933,7 @@
               <w:rPr>
                 <w:sz w:val="17"/>
               </w:rPr>
-              <w:t>4秒静止補正</w:t>
+              <w:t>明示的な4秒静止補正</w:t>
             </w:r>
           </w:p>
         </w:tc>
@@ -2965,7 +2965,7 @@
               <w:rPr>
                 <w:sz w:val="17"/>
               </w:rPr>
-              <w:t>完了後sensor-onまたはarmed</w:t>
+              <w:t>成功または失敗後sensor-on</w:t>
             </w:r>
           </w:p>
         </w:tc>
@@ -3060,7 +3060,7 @@
               <w:rPr>
                 <w:sz w:val="17"/>
               </w:rPr>
-              <w:t>Auto ONまたはManual ON</w:t>
+              <w:t>Calibration Auto待機 手動開始</w:t>
             </w:r>
           </w:p>
         </w:tc>
@@ -3253,7 +3253,7 @@
               <w:rPr>
                 <w:sz w:val="17"/>
               </w:rPr>
-              <w:t>STOPまたはManual OFF</w:t>
+              <w:t>自動停止または計測停止</w:t>
             </w:r>
           </w:p>
         </w:tc>
@@ -3319,7 +3319,7 @@
               <w:rPr>
                 <w:sz w:val="17"/>
               </w:rPr>
-              <w:t>保存完了</w:t>
+              <w:t>計測完了 保存済み</w:t>
             </w:r>
           </w:p>
         </w:tc>
@@ -3446,7 +3446,7 @@
               <w:rPr>
                 <w:sz w:val="17"/>
               </w:rPr>
-              <w:t>Sensor ONでcalibrating</w:t>
+              <w:t>Sensor ONでsensor-on</w:t>
             </w:r>
           </w:p>
         </w:tc>
@@ -4156,7 +4156,7 @@
     </w:p>
     <w:p>
       <w:r>
-        <w:t>Sensor ON後の4秒間で加速度とヨーレートの平均を計算する。重力を含む加速度の平均を正規化し、端末座標上の重力方向とする。</w:t>
+        <w:t>Sensor ONは取得だけを開始する。Calibration操作後の4秒間で加速度とヨーレートの平均を計算し、重力を含む加速度の平均を正規化して端末座標上の重力方向とする。</w:t>
       </w:r>
     </w:p>
     <w:p>
@@ -4178,6 +4178,11 @@
       </w:r>
     </w:p>
     <w:p>
+      <w:r>
+        <w:t>完了条件は15 Hz以上かつ60サンプル以上、平均加速度0.12 G以下、重力0.75から1.25 G、前半と後半の重力方向差7度以下、振動RMS 0.6 G以下とする。条件外はfailed状態とし理由を表示する。</w:t>
+      </w:r>
+    </w:p>
+    <w:p>
       <w:pPr>
         <w:pStyle w:val="Heading2"/>
       </w:pPr>
@@ -4187,7 +4192,7 @@
     </w:p>
     <w:p>
       <w:r>
-        <w:t>補正済み3軸加速度は、車体軸決定、イベント判定、速度積分の前に時定数0.08秒の一次低域通過フィルタへ通す。自動STARTは前後Gがしきい値を140 ms継続した場合に成立させ、開始時刻は継続判定の先頭へ戻す。静止補正はSTART待機時と同じエンジンアイドリング状態で行う。</w:t>
+        <w:t>補正済み3軸加速度は、車体軸決定、イベント判定、速度積分の前に時定数0.08秒の一次低域通過フィルタへ通す。自動STARTは前後Gがしきい値を140 ms継続した場合に成立させ、開始時刻は継続判定の先頭へ戻す。確認区間の加速度は仮積分して現在速度へ引き継ぐ。静止補正はSTART待機時と同じエンジンアイドリング状態で行う。</w:t>
       </w:r>
     </w:p>
     <w:p>
@@ -4292,7 +4297,9 @@
           <w:rFonts w:ascii="Consolas" w:hAnsi="Consolas"/>
           <w:sz w:val="18"/>
         </w:rPr>
-        <w:t>v_k = max(0, v + (a_long * 9.80665 - 0.025 * v) * dt)</w:t>
+        <w:t>a_drive = 0.75 * measured_long_g + 0.25 * a_long</w:t>
+        <w:br/>
+        <w:t>v_k = max(0, v + (a_drive * 9.80665 - 0.025 * v) * dt)</w:t>
         <w:br/>
         <w:t>a_long_k = a_long * exp(-dt / 0.7)</w:t>
         <w:br/>
@@ -4305,7 +4312,7 @@
     </w:p>
     <w:p>
       <w:r>
-        <w:t>状態遷移ヤコビアンFで共分散を予測し、P = FPF^T + Qとする。dtは0.005秒から0.12秒へ制限し、Safari復帰時の過大積分を防ぐ。</w:t>
+        <w:t>現在サンプルの前後Gを同じ周期の速度更新へ75パーセント反映し、従来の1周期遅れを減らす。速度プロセスノイズは0.18 dtとする。dtは0.005秒から0.12秒へ制限する。</w:t>
       </w:r>
     </w:p>
     <w:p>
@@ -4381,7 +4388,7 @@
     </w:p>
     <w:p>
       <w:r>
-        <w:t>前後Gが0.035 G未満、左右Gが0.040 G未満、ヨーレートが3.5 deg/s未満の状態が450 ms続くと速度を0へ拘束する。</w:t>
+        <w:t>低運動状態だけでは等速走行と停止を区別できない。450 msの低運動に加え、2.5秒以内のGPSが0.8 m/s未満、またはGPSなしで速度0.35 m/s未満かつ3.5秒以内に減速を検出した場合だけ速度を0へ拘束する。</w:t>
       </w:r>
     </w:p>
     <w:p>
@@ -5323,7 +5330,7 @@
     </w:p>
     <w:p>
       <w:r>
-        <w:t>自動停止は速度0.65 m/s未満、前後G絶対値0.05 G未満、左右G絶対値0.06 G未満が950 ms続き、START後1.5秒以上経過した場合に成立する。</w:t>
+        <w:t>自動停止は低運動状態に加え、GPS停止または低速かつ直前の減速という停止根拠が950 ms続き、START後1.5秒以上経過した場合に成立する。</w:t>
       </w:r>
     </w:p>
     <w:p>
@@ -6393,7 +6400,7 @@
         <w:spacing w:after="60"/>
       </w:pPr>
       <w:r>
-        <w:t>Service Workerはmoto-gym-ana-v11としてアプリシェルをキャッシュする。</w:t>
+        <w:t>Service Workerはmoto-gym-ana-v12としてアプリシェルをキャッシュする。</w:t>
       </w:r>
     </w:p>
     <w:p>
@@ -7041,7 +7048,7 @@
         <w:spacing w:after="60"/>
       </w:pPr>
       <w:r>
-        <w:t>4秒静止後にキャリブレーションが完了する。</w:t>
+        <w:t>静止した4秒補正はcomplete、補正中に動かすとfailedになる。</w:t>
       </w:r>
     </w:p>
     <w:p>
@@ -7050,7 +7057,7 @@
         <w:spacing w:after="60"/>
       </w:pPr>
       <w:r>
-        <w:t>START時の速度が0 km/hである。</w:t>
+        <w:t>STARTイベントは時刻0、速度0 km/hで、確認区間の速度が現在値へ引き継がれる。</w:t>
       </w:r>
     </w:p>
     <w:p>
@@ -7068,7 +7075,7 @@
         <w:spacing w:after="60"/>
       </w:pPr>
       <w:r>
-        <w:t>静止継続で速度が0へ戻る。</w:t>
+        <w:t>等速相当の低運動だけでは停止せず、GPS停止で速度が0へ戻る。</w:t>
       </w:r>
     </w:p>
     <w:p>
@@ -7103,7 +7110,7 @@
         <w:spacing w:after="60"/>
       </w:pPr>
       <w:r>
-        <w:t>端末を固定してSensor ONを押し、4秒静止する。</w:t>
+        <w:t>端末を固定してSensor ON後にCalibrationを押し、4秒静止する。</w:t>
       </w:r>
     </w:p>
     <w:p>

</xml_diff>

<commit_message>
Keep sensor standby from recording runs
</commit_message>
<xml_diff>
--- a/docs/generated/Gym_Ana_System_Design.docx
+++ b/docs/generated/Gym_Ana_System_Design.docx
@@ -3458,6 +3458,11 @@
       </w:pPr>
     </w:p>
     <w:p>
+      <w:r>
+        <w:t>sensor-onは権限取得とGPS測位準備だけを行い、速度積分、グラフ追加、走行サンプル保存は行わない。armedではSTART判定に必要な加速度だけを評価し、確定前の表示速度は0とする。</w:t>
+      </w:r>
+    </w:p>
+    <w:p>
       <w:pPr>
         <w:pStyle w:val="Heading1"/>
       </w:pPr>
@@ -4245,7 +4250,7 @@
     </w:p>
     <w:p>
       <w:r>
-        <w:t>最初の水平加速が0.08 G以上になった時点で前方向を固定する。取付後に端末が動いた場合は再度Sensor ONを実行する。</w:t>
+        <w:t>最初の水平加速が0.08 G以上になった時点で前方向を固定する。取付後に端末が動いた場合は再度Calibrationを実行する。</w:t>
       </w:r>
     </w:p>
     <w:p>
@@ -6400,7 +6405,7 @@
         <w:spacing w:after="60"/>
       </w:pPr>
       <w:r>
-        <w:t>Service Workerはmoto-gym-ana-v12としてアプリシェルをキャッシュする。</w:t>
+        <w:t>Service Workerはmoto-gym-ana-v13としてアプリシェルをキャッシュする。</w:t>
       </w:r>
     </w:p>
     <w:p>

</xml_diff>

<commit_message>
Update system design for three-axis gyro
</commit_message>
<xml_diff>
--- a/docs/generated/Gym_Ana_System_Design.docx
+++ b/docs/generated/Gym_Ana_System_Design.docx
@@ -31,9 +31,9 @@
         <w:jc w:val="center"/>
       </w:pPr>
       <w:r>
-        <w:t>対象版  f59a182</w:t>
+        <w:t>対象版  f1079de</w:t>
         <w:br/>
-        <w:t>作成日  2026年9月20日</w:t>
+        <w:t>作成日  2026年10月3日</w:t>
       </w:r>
     </w:p>
     <w:p>
@@ -3885,7 +3885,7 @@
               <w:rPr>
                 <w:sz w:val="18"/>
               </w:rPr>
-              <w:t>rotationRate.alpha</w:t>
+              <w:t>rotationRate beta/gamma/alpha</w:t>
             </w:r>
           </w:p>
         </w:tc>
@@ -3947,7 +3947,7 @@
               <w:rPr>
                 <w:sz w:val="18"/>
               </w:rPr>
-              <w:t>ヨーレート</w:t>
+              <w:t>端末X/Y/Z軸の角速度</w:t>
             </w:r>
           </w:p>
         </w:tc>
@@ -4161,7 +4161,7 @@
     </w:p>
     <w:p>
       <w:r>
-        <w:t>Sensor ONは取得だけを開始する。Calibration操作後の4秒間で加速度とヨーレートの平均を計算し、重力を含む加速度の平均を正規化して端末座標上の重力方向とする。</w:t>
+        <w:t>Sensor ONは取得だけを開始する。Calibration操作後の4秒間で加速度と3軸角速度の平均を計算し、重力を含む加速度の平均を正規化して端末座標上の重力方向とする。</w:t>
       </w:r>
     </w:p>
     <w:p>
@@ -4177,9 +4177,11 @@
         </w:rPr>
         <w:t>b_a = mean([a_x, a_y, a_z])</w:t>
         <w:br/>
-        <w:t>b_w = mean(yaw_rate)</w:t>
+        <w:t>b_w = mean([gyro_x, gyro_y, gyro_z])</w:t>
         <w:br/>
         <w:t>g_d = normalize(mean(accelerationIncludingGravity))</w:t>
+        <w:br/>
+        <w:t>yaw_rate = dot(gyro - b_w, g_d)</w:t>
       </w:r>
     </w:p>
     <w:p>
@@ -4363,6 +4365,11 @@
     <w:p>
       <w:r>
         <w:t>GPSの直接速度があればスカラー観測として速度状態を更新する。直接速度がない場合は連続する位置のHaversine距離から速度を算出する。水平精度が50 mを超える測位と90 m/sを超える値は採用しない。</w:t>
+      </w:r>
+    </w:p>
+    <w:p>
+      <w:r>
+        <w:t>手動開始で2.5秒以内の有効GPSがある場合はその速度を初期値に使う。0.5秒超のIMU欠測はGAPとして記録し、次の有効GPSで速度状態と共分散を再初期化しSYNCを記録する。</w:t>
       </w:r>
     </w:p>
     <w:p>
@@ -6098,6 +6105,102 @@
               <w:rPr>
                 <w:sz w:val="17"/>
               </w:rPr>
+              <w:t>gpsTimestampMs  gpsAgeMs</w:t>
+            </w:r>
+          </w:p>
+        </w:tc>
+        <w:tc>
+          <w:tcPr>
+            <w:tcW w:type="dxa" w:w="1656"/>
+            <w:tcBorders>
+              <w:top w:val="single" w:sz="6" w:color="D9D9D9"/>
+              <w:left w:val="single" w:sz="6" w:color="D9D9D9"/>
+              <w:bottom w:val="single" w:sz="6" w:color="D9D9D9"/>
+              <w:right w:val="single" w:sz="6" w:color="D9D9D9"/>
+              <w:insideH w:val="single" w:sz="6" w:color="D9D9D9"/>
+              <w:insideV w:val="single" w:sz="6" w:color="D9D9D9"/>
+            </w:tcBorders>
+            <w:tcMar>
+              <w:top w:w="100" w:type="dxa"/>
+              <w:start w:w="120" w:type="dxa"/>
+              <w:bottom w:w="100" w:type="dxa"/>
+              <w:end w:w="120" w:type="dxa"/>
+            </w:tcMar>
+            <w:vAlign w:val="center"/>
+          </w:tcPr>
+          <w:p>
+            <w:pPr>
+              <w:jc w:val="left"/>
+            </w:pPr>
+            <w:r>
+              <w:rPr>
+                <w:sz w:val="17"/>
+              </w:rPr>
+              <w:t>ms</w:t>
+            </w:r>
+          </w:p>
+        </w:tc>
+        <w:tc>
+          <w:tcPr>
+            <w:tcW w:type="dxa" w:w="5112"/>
+            <w:tcBorders>
+              <w:top w:val="single" w:sz="6" w:color="D9D9D9"/>
+              <w:left w:val="single" w:sz="6" w:color="D9D9D9"/>
+              <w:bottom w:val="single" w:sz="6" w:color="D9D9D9"/>
+              <w:right w:val="single" w:sz="6" w:color="D9D9D9"/>
+              <w:insideH w:val="single" w:sz="6" w:color="D9D9D9"/>
+              <w:insideV w:val="single" w:sz="6" w:color="D9D9D9"/>
+            </w:tcBorders>
+            <w:tcMar>
+              <w:top w:w="100" w:type="dxa"/>
+              <w:start w:w="120" w:type="dxa"/>
+              <w:bottom w:w="100" w:type="dxa"/>
+              <w:end w:w="120" w:type="dxa"/>
+            </w:tcMar>
+            <w:vAlign w:val="center"/>
+          </w:tcPr>
+          <w:p>
+            <w:pPr>
+              <w:jc w:val="left"/>
+            </w:pPr>
+            <w:r>
+              <w:rPr>
+                <w:sz w:val="17"/>
+              </w:rPr>
+              <w:t>GPS測位時刻と受信時の観測年齢</w:t>
+            </w:r>
+          </w:p>
+        </w:tc>
+      </w:tr>
+      <w:tr>
+        <w:tc>
+          <w:tcPr>
+            <w:tcW w:type="dxa" w:w="2880"/>
+            <w:tcBorders>
+              <w:top w:val="single" w:sz="6" w:color="D9D9D9"/>
+              <w:left w:val="single" w:sz="6" w:color="D9D9D9"/>
+              <w:bottom w:val="single" w:sz="6" w:color="D9D9D9"/>
+              <w:right w:val="single" w:sz="6" w:color="D9D9D9"/>
+              <w:insideH w:val="single" w:sz="6" w:color="D9D9D9"/>
+              <w:insideV w:val="single" w:sz="6" w:color="D9D9D9"/>
+            </w:tcBorders>
+            <w:tcMar>
+              <w:top w:w="100" w:type="dxa"/>
+              <w:start w:w="120" w:type="dxa"/>
+              <w:bottom w:w="100" w:type="dxa"/>
+              <w:end w:w="120" w:type="dxa"/>
+            </w:tcMar>
+            <w:vAlign w:val="center"/>
+            <w:shd w:fill="F4F6F7"/>
+          </w:tcPr>
+          <w:p>
+            <w:pPr>
+              <w:jc w:val="center"/>
+            </w:pPr>
+            <w:r>
+              <w:rPr>
+                <w:sz w:val="17"/>
+              </w:rPr>
               <w:t>bankDeg  yawRate</w:t>
             </w:r>
           </w:p>
@@ -6120,6 +6223,7 @@
               <w:end w:w="120" w:type="dxa"/>
             </w:tcMar>
             <w:vAlign w:val="center"/>
+            <w:shd w:fill="F4F6F7"/>
           </w:tcPr>
           <w:p>
             <w:pPr>
@@ -6151,6 +6255,7 @@
               <w:end w:w="120" w:type="dxa"/>
             </w:tcMar>
             <w:vAlign w:val="center"/>
+            <w:shd w:fill="F4F6F7"/>
           </w:tcPr>
           <w:p>
             <w:pPr>
@@ -6160,7 +6265,102 @@
               <w:rPr>
                 <w:sz w:val="17"/>
               </w:rPr>
-              <w:t>姿勢と旋回</w:t>
+              <w:t>姿勢と車体鉛直軸回りの旋回</w:t>
+            </w:r>
+          </w:p>
+        </w:tc>
+      </w:tr>
+      <w:tr>
+        <w:tc>
+          <w:tcPr>
+            <w:tcW w:type="dxa" w:w="2880"/>
+            <w:tcBorders>
+              <w:top w:val="single" w:sz="6" w:color="D9D9D9"/>
+              <w:left w:val="single" w:sz="6" w:color="D9D9D9"/>
+              <w:bottom w:val="single" w:sz="6" w:color="D9D9D9"/>
+              <w:right w:val="single" w:sz="6" w:color="D9D9D9"/>
+              <w:insideH w:val="single" w:sz="6" w:color="D9D9D9"/>
+              <w:insideV w:val="single" w:sz="6" w:color="D9D9D9"/>
+            </w:tcBorders>
+            <w:tcMar>
+              <w:top w:w="100" w:type="dxa"/>
+              <w:start w:w="120" w:type="dxa"/>
+              <w:bottom w:w="100" w:type="dxa"/>
+              <w:end w:w="120" w:type="dxa"/>
+            </w:tcMar>
+            <w:vAlign w:val="center"/>
+          </w:tcPr>
+          <w:p>
+            <w:pPr>
+              <w:jc w:val="center"/>
+            </w:pPr>
+            <w:r>
+              <w:rPr>
+                <w:sz w:val="17"/>
+              </w:rPr>
+              <w:t>gyroX/Y/Z  rollRate</w:t>
+            </w:r>
+          </w:p>
+        </w:tc>
+        <w:tc>
+          <w:tcPr>
+            <w:tcW w:type="dxa" w:w="1656"/>
+            <w:tcBorders>
+              <w:top w:val="single" w:sz="6" w:color="D9D9D9"/>
+              <w:left w:val="single" w:sz="6" w:color="D9D9D9"/>
+              <w:bottom w:val="single" w:sz="6" w:color="D9D9D9"/>
+              <w:right w:val="single" w:sz="6" w:color="D9D9D9"/>
+              <w:insideH w:val="single" w:sz="6" w:color="D9D9D9"/>
+              <w:insideV w:val="single" w:sz="6" w:color="D9D9D9"/>
+            </w:tcBorders>
+            <w:tcMar>
+              <w:top w:w="100" w:type="dxa"/>
+              <w:start w:w="120" w:type="dxa"/>
+              <w:bottom w:w="100" w:type="dxa"/>
+              <w:end w:w="120" w:type="dxa"/>
+            </w:tcMar>
+            <w:vAlign w:val="center"/>
+          </w:tcPr>
+          <w:p>
+            <w:pPr>
+              <w:jc w:val="left"/>
+            </w:pPr>
+            <w:r>
+              <w:rPr>
+                <w:sz w:val="17"/>
+              </w:rPr>
+              <w:t>deg/s</w:t>
+            </w:r>
+          </w:p>
+        </w:tc>
+        <w:tc>
+          <w:tcPr>
+            <w:tcW w:type="dxa" w:w="5112"/>
+            <w:tcBorders>
+              <w:top w:val="single" w:sz="6" w:color="D9D9D9"/>
+              <w:left w:val="single" w:sz="6" w:color="D9D9D9"/>
+              <w:bottom w:val="single" w:sz="6" w:color="D9D9D9"/>
+              <w:right w:val="single" w:sz="6" w:color="D9D9D9"/>
+              <w:insideH w:val="single" w:sz="6" w:color="D9D9D9"/>
+              <w:insideV w:val="single" w:sz="6" w:color="D9D9D9"/>
+            </w:tcBorders>
+            <w:tcMar>
+              <w:top w:w="100" w:type="dxa"/>
+              <w:start w:w="120" w:type="dxa"/>
+              <w:bottom w:w="100" w:type="dxa"/>
+              <w:end w:w="120" w:type="dxa"/>
+            </w:tcMar>
+            <w:vAlign w:val="center"/>
+          </w:tcPr>
+          <w:p>
+            <w:pPr>
+              <w:jc w:val="left"/>
+            </w:pPr>
+            <w:r>
+              <w:rPr>
+                <w:sz w:val="17"/>
+              </w:rPr>
+              <w:t>端末3軸角速度と車体前後軸回り角速度</w:t>
             </w:r>
           </w:p>
         </w:tc>
@@ -6396,6 +6596,24 @@
         <w:spacing w:after="60"/>
       </w:pPr>
       <w:r>
+        <w:t>履歴で任意の走行を複数選択し、選択JSONまたは選択CSVを1ファイルで出力する。</w:t>
+      </w:r>
+    </w:p>
+    <w:p>
+      <w:pPr>
+        <w:pStyle w:val="ListBullet"/>
+        <w:spacing w:after="60"/>
+      </w:pPr>
+      <w:r>
+        <w:t>選択削除は確認後にIndexedDBから対象だけを削除する。</w:t>
+      </w:r>
+    </w:p>
+    <w:p>
+      <w:pPr>
+        <w:pStyle w:val="ListBullet"/>
+        <w:spacing w:after="60"/>
+      </w:pPr>
+      <w:r>
         <w:t>1走行の上限は20,000サンプルで、60 Hzでは約5.6分に相当する。</w:t>
       </w:r>
     </w:p>
@@ -6405,7 +6623,7 @@
         <w:spacing w:after="60"/>
       </w:pPr>
       <w:r>
-        <w:t>Service Workerはmoto-gym-ana-v13としてアプリシェルをキャッシュする。</w:t>
+        <w:t>Service Workerはmoto-gym-ana-v16としてアプリシェルをキャッシュする。</w:t>
       </w:r>
     </w:p>
     <w:p>
@@ -7062,6 +7280,15 @@
         <w:spacing w:after="60"/>
       </w:pPr>
       <w:r>
+        <w:t>3軸ジャイロはキャリブレーション済み車体鉛直軸へ射影される。</w:t>
+      </w:r>
+    </w:p>
+    <w:p>
+      <w:pPr>
+        <w:pStyle w:val="ListBullet"/>
+        <w:spacing w:after="60"/>
+      </w:pPr>
+      <w:r>
         <w:t>STARTイベントは時刻0、速度0 km/hで、確認区間の速度が現在値へ引き継がれる。</w:t>
       </w:r>
     </w:p>
@@ -7090,6 +7317,33 @@
       </w:pPr>
       <w:r>
         <w:t>GPS観測が速度状態を補正する。</w:t>
+      </w:r>
+    </w:p>
+    <w:p>
+      <w:pPr>
+        <w:pStyle w:val="ListBullet"/>
+        <w:spacing w:after="60"/>
+      </w:pPr>
+      <w:r>
+        <w:t>走行中の手動開始は新鮮なGPS速度から開始する。</w:t>
+      </w:r>
+    </w:p>
+    <w:p>
+      <w:pPr>
+        <w:pStyle w:val="ListBullet"/>
+        <w:spacing w:after="60"/>
+      </w:pPr>
+      <w:r>
+        <w:t>0.5秒超のIMU欠測はGAPと次回GPSのSYNCを記録する。</w:t>
+      </w:r>
+    </w:p>
+    <w:p>
+      <w:pPr>
+        <w:pStyle w:val="ListBullet"/>
+        <w:spacing w:after="60"/>
+      </w:pPr>
+      <w:r>
+        <w:t>複数走行CSVはrun_idとstarted_at_isoを含み、全行の列数が一致する。</w:t>
       </w:r>
     </w:p>
     <w:p>
@@ -7152,6 +7406,15 @@
       </w:pPr>
       <w:r>
         <w:t>JSONとCSVを出力し、動画または既知距離の速度と比較する。</w:t>
+      </w:r>
+    </w:p>
+    <w:p>
+      <w:pPr>
+        <w:pStyle w:val="ListNumber"/>
+        <w:spacing w:after="60"/>
+      </w:pPr>
+      <w:r>
+        <w:t>GoPro GPXの方位変化率とヨーの符号、遅延、RMSE、相関を比較する。</w:t>
       </w:r>
     </w:p>
     <w:p>

</xml_diff>

<commit_message>
Tune speed model from October 4 ride data
</commit_message>
<xml_diff>
--- a/docs/generated/Gym_Ana_System_Design.docx
+++ b/docs/generated/Gym_Ana_System_Design.docx
@@ -31,9 +31,9 @@
         <w:jc w:val="center"/>
       </w:pPr>
       <w:r>
-        <w:t>対象版  f1079de</w:t>
+        <w:t>対象版  2026-10-04 速度モデル更新</w:t>
         <w:br/>
-        <w:t>作成日  2026年10月3日</w:t>
+        <w:t>作成日  2026年10月4日</w:t>
       </w:r>
     </w:p>
     <w:p>
@@ -4306,7 +4306,7 @@
         </w:rPr>
         <w:t>a_drive = 0.75 * measured_long_g + 0.25 * a_long</w:t>
         <w:br/>
-        <w:t>v_k = max(0, v + (a_drive * 9.80665 - 0.025 * v) * dt)</w:t>
+        <w:t>v_k = max(0, v + a_drive * 9.80665 * dt)</w:t>
         <w:br/>
         <w:t>a_long_k = a_long * exp(-dt / 0.7)</w:t>
         <w:br/>
@@ -4319,7 +4319,7 @@
     </w:p>
     <w:p>
       <w:r>
-        <w:t>現在サンプルの前後Gを同じ周期の速度更新へ75パーセント反映し、従来の1周期遅れを減らす。速度プロセスノイズは0.18 dtとする。dtは0.005秒から0.12秒へ制限する。</w:t>
+        <w:t>現在サンプルの前後Gを同じ周期の速度更新へ75パーセント反映し、従来の1周期遅れを減らす。IMUは正味加速度を観測するため、速度へ別の走行抵抗項は加えない。2026年10月4日のログ再生に基づき、速度プロセスノイズは0.45 dtとする。dtは0.005秒から0.12秒へ制限する。</w:t>
       </w:r>
     </w:p>
     <w:p>
@@ -6623,7 +6623,7 @@
         <w:spacing w:after="60"/>
       </w:pPr>
       <w:r>
-        <w:t>Service Workerはmoto-gym-ana-v16としてアプリシェルをキャッシュする。</w:t>
+        <w:t>Service Workerはmoto-gym-ana-v17としてアプリシェルをキャッシュする。</w:t>
       </w:r>
     </w:p>
     <w:p>
@@ -8032,6 +8032,11 @@
       </w:pPr>
     </w:p>
     <w:p>
+      <w:r>
+        <w:br w:type="page"/>
+      </w:r>
+    </w:p>
+    <w:p>
       <w:pPr>
         <w:pStyle w:val="Heading1"/>
       </w:pPr>
@@ -8104,8 +8109,14 @@
       <w:jc w:val="right"/>
     </w:pPr>
     <w:r>
+      <w:rPr>
+        <w:rFonts w:ascii="Arial" w:hAnsi="Arial" w:eastAsia="Arial"/>
+        <w:sz w:val="17"/>
+      </w:rPr>
       <w:fldChar w:fldCharType="begin"/>
       <w:instrText xml:space="preserve"> PAGE </w:instrText>
+      <w:fldChar w:fldCharType="separate"/>
+      <w:t>1</w:t>
       <w:fldChar w:fldCharType="end"/>
     </w:r>
   </w:p>
@@ -8125,7 +8136,7 @@
         <w:color w:val="6B7280"/>
         <w:sz w:val="17"/>
       </w:rPr>
-      <w:t>Gym Ana システム設計書</w:t>
+      <w:t>Gym Ana 設計書</w:t>
     </w:r>
   </w:p>
 </w:hdr>

</xml_diff>

<commit_message>
Tune GPS fusion from October 10 ride data
</commit_message>
<xml_diff>
--- a/docs/generated/Gym_Ana_System_Design.docx
+++ b/docs/generated/Gym_Ana_System_Design.docx
@@ -31,9 +31,9 @@
         <w:jc w:val="center"/>
       </w:pPr>
       <w:r>
-        <w:t>対象版  2026-10-04 速度モデル更新</w:t>
+        <w:t>対象版  2026-10-10 実走データ反映</w:t>
         <w:br/>
-        <w:t>作成日  2026年10月4日</w:t>
+        <w:t>作成日  2026年10月10日</w:t>
       </w:r>
     </w:p>
     <w:p>
@@ -2593,7 +2593,7 @@
     </w:p>
     <w:p>
       <w:r>
-        <w:t>Auto待機は発進待ちを作る。最初の明確な水平加速で車体前方向を確定し、前後Gが感度しきい値を140 ms継続して超えるとSTARTする。手動開始は操作時刻から直ちに計測する。計測停止はどちらの方式でも走行を終了して保存する。</w:t>
+        <w:t>Auto待機は低運動とGPS停止を600 ms確認してから発進待ちになる。確認後の最初の明確な水平加速で車体前方向を確定し、前後Gが感度しきい値を140 ms継続して超えるとSTARTする。手動開始は操作時刻から直ちに計測する。</w:t>
       </w:r>
     </w:p>
     <w:p>
@@ -3126,7 +3126,7 @@
               <w:rPr>
                 <w:sz w:val="17"/>
               </w:rPr>
-              <w:t>自動発進待ち</w:t>
+              <w:t>静止確認と自動発進待ち</w:t>
             </w:r>
           </w:p>
         </w:tc>
@@ -3158,7 +3158,7 @@
               <w:rPr>
                 <w:sz w:val="17"/>
               </w:rPr>
-              <w:t>START検出でrunning</w:t>
+              <w:t>静止確認後のSTARTでrunning</w:t>
             </w:r>
           </w:p>
         </w:tc>
@@ -3459,7 +3459,7 @@
     </w:p>
     <w:p>
       <w:r>
-        <w:t>sensor-onは権限取得とGPS測位準備だけを行い、速度積分、グラフ追加、走行サンプル保存は行わない。armedではSTART判定に必要な加速度だけを評価し、確定前の表示速度は0とする。</w:t>
+        <w:t>sensor-onは権限取得とGPS測位準備だけを行い、速度積分、グラフ追加、走行サンプル保存は行わない。armedでは600 msの静止確認後だけSTART判定と前後軸ロックを有効にし、確定前の表示速度は0とする。</w:t>
       </w:r>
     </w:p>
     <w:p>
@@ -4199,7 +4199,7 @@
     </w:p>
     <w:p>
       <w:r>
-        <w:t>補正済み3軸加速度は、車体軸決定、イベント判定、速度積分の前に時定数0.08秒の一次低域通過フィルタへ通す。自動STARTは前後Gがしきい値を140 ms継続した場合に成立させ、開始時刻は継続判定の先頭へ戻す。確認区間の加速度は仮積分して現在速度へ引き継ぐ。静止補正はSTART待機時と同じエンジンアイドリング状態で行う。</w:t>
+        <w:t>補正済み3軸加速度は、車体軸決定、イベント判定、速度積分の前に時定数0.08秒の一次低域通過フィルタへ通す。Auto待機後は低運動とGPS停止を600 ms確認し、その後に前後Gがしきい値を140 ms継続した場合だけSTARTする。確認区間の加速度は仮積分して現在速度へ引き継ぐ。</w:t>
       </w:r>
     </w:p>
     <w:p>
@@ -4252,7 +4252,7 @@
     </w:p>
     <w:p>
       <w:r>
-        <w:t>最初の水平加速が0.08 G以上になった時点で前方向を固定する。取付後に端末が動いた場合は再度Calibrationを実行する。</w:t>
+        <w:t>Autoの静止確認後または手動計測中に、最初の水平加速が0.08 G以上になった時点で前方向を固定する。走行中にAuto待機を押した場合は軸を固定しない。</w:t>
       </w:r>
     </w:p>
     <w:p>
@@ -4319,7 +4319,7 @@
     </w:p>
     <w:p>
       <w:r>
-        <w:t>現在サンプルの前後Gを同じ周期の速度更新へ75パーセント反映し、従来の1周期遅れを減らす。IMUは正味加速度を観測するため、速度へ別の走行抵抗項は加えない。2026年10月4日のログ再生に基づき、速度プロセスノイズは0.45 dtとする。dtは0.005秒から0.12秒へ制限する。</w:t>
+        <w:t>現在サンプルの前後Gを同じ周期の速度更新へ75パーセント反映する。IMUは正味加速度を観測するため、速度へ別の走行抵抗項は加えない。10月4日と10日のログ再生に基づき、速度プロセスノイズは1.2 dtとする。dtは0.005秒から0.12秒へ制限する。</w:t>
       </w:r>
     </w:p>
     <w:p>
@@ -4364,7 +4364,7 @@
     </w:p>
     <w:p>
       <w:r>
-        <w:t>GPSの直接速度があればスカラー観測として速度状態を更新する。直接速度がない場合は連続する位置のHaversine距離から速度を算出する。水平精度が50 mを超える測位と90 m/sを超える値は採用しない。</w:t>
+        <w:t>GPSの直接速度があればスカラー観測として速度状態を更新する。直接速度がない場合は連続する位置のHaversine距離から速度を算出する。実走再生に基づき基準標準偏差へ0.35を掛け、GPS補正を強める。水平精度50 m超と90 m/s超は採用しない。</w:t>
       </w:r>
     </w:p>
     <w:p>
@@ -4385,9 +4385,9 @@
         </w:rPr>
         <w:t>H_gps = [1, 0, 0, 0, 0]</w:t>
         <w:br/>
-        <w:t>sigma_direct = clamp(accuracy * 0.06, 0.4, 3.0)</w:t>
+        <w:t>sigma = max(0.15, base_sigma * 0.35)</w:t>
         <w:br/>
-        <w:t>sigma_position = clamp(accuracy * 0.25, 1.2, 5.0)</w:t>
+        <w:t>Q_speed = 1.2 * dt</w:t>
       </w:r>
     </w:p>
     <w:p>
@@ -6623,7 +6623,7 @@
         <w:spacing w:after="60"/>
       </w:pPr>
       <w:r>
-        <w:t>Service Workerはmoto-gym-ana-v17としてアプリシェルをキャッシュする。</w:t>
+        <w:t>Service Workerはmoto-gym-ana-v18としてアプリシェルをキャッシュする。</w:t>
       </w:r>
     </w:p>
     <w:p>
@@ -7289,6 +7289,15 @@
         <w:spacing w:after="60"/>
       </w:pPr>
       <w:r>
+        <w:t>走行中を示すGPS速度でAuto待機を有効にしてもSTARTせず、静止確認後だけ発進待ちになる。</w:t>
+      </w:r>
+    </w:p>
+    <w:p>
+      <w:pPr>
+        <w:pStyle w:val="ListBullet"/>
+        <w:spacing w:after="60"/>
+      </w:pPr>
+      <w:r>
         <w:t>STARTイベントは時刻0、速度0 km/hで、確認区間の速度が現在値へ引き継がれる。</w:t>
       </w:r>
     </w:p>
@@ -7930,111 +7939,11 @@
           </w:p>
         </w:tc>
       </w:tr>
-      <w:tr>
-        <w:tc>
-          <w:tcPr>
-            <w:tcW w:type="dxa" w:w="2880"/>
-            <w:tcBorders>
-              <w:top w:val="single" w:sz="6" w:color="D9D9D9"/>
-              <w:left w:val="single" w:sz="6" w:color="D9D9D9"/>
-              <w:bottom w:val="single" w:sz="6" w:color="D9D9D9"/>
-              <w:right w:val="single" w:sz="6" w:color="D9D9D9"/>
-              <w:insideH w:val="single" w:sz="6" w:color="D9D9D9"/>
-              <w:insideV w:val="single" w:sz="6" w:color="D9D9D9"/>
-            </w:tcBorders>
-            <w:tcMar>
-              <w:top w:w="100" w:type="dxa"/>
-              <w:start w:w="120" w:type="dxa"/>
-              <w:bottom w:w="100" w:type="dxa"/>
-              <w:end w:w="120" w:type="dxa"/>
-            </w:tcMar>
-            <w:vAlign w:val="center"/>
-          </w:tcPr>
-          <w:p>
-            <w:pPr>
-              <w:jc w:val="center"/>
-            </w:pPr>
-            <w:r>
-              <w:rPr>
-                <w:sz w:val="16"/>
-              </w:rPr>
-              <w:t>簡易confidence</w:t>
-            </w:r>
-          </w:p>
-        </w:tc>
-        <w:tc>
-          <w:tcPr>
-            <w:tcW w:type="dxa" w:w="2952"/>
-            <w:tcBorders>
-              <w:top w:val="single" w:sz="6" w:color="D9D9D9"/>
-              <w:left w:val="single" w:sz="6" w:color="D9D9D9"/>
-              <w:bottom w:val="single" w:sz="6" w:color="D9D9D9"/>
-              <w:right w:val="single" w:sz="6" w:color="D9D9D9"/>
-              <w:insideH w:val="single" w:sz="6" w:color="D9D9D9"/>
-              <w:insideV w:val="single" w:sz="6" w:color="D9D9D9"/>
-            </w:tcBorders>
-            <w:tcMar>
-              <w:top w:w="100" w:type="dxa"/>
-              <w:start w:w="120" w:type="dxa"/>
-              <w:bottom w:w="100" w:type="dxa"/>
-              <w:end w:w="120" w:type="dxa"/>
-            </w:tcMar>
-            <w:vAlign w:val="center"/>
-          </w:tcPr>
-          <w:p>
-            <w:pPr>
-              <w:jc w:val="left"/>
-            </w:pPr>
-            <w:r>
-              <w:rPr>
-                <w:sz w:val="16"/>
-              </w:rPr>
-              <w:t>統計的信頼区間ではない</w:t>
-            </w:r>
-          </w:p>
-        </w:tc>
-        <w:tc>
-          <w:tcPr>
-            <w:tcW w:type="dxa" w:w="3816"/>
-            <w:tcBorders>
-              <w:top w:val="single" w:sz="6" w:color="D9D9D9"/>
-              <w:left w:val="single" w:sz="6" w:color="D9D9D9"/>
-              <w:bottom w:val="single" w:sz="6" w:color="D9D9D9"/>
-              <w:right w:val="single" w:sz="6" w:color="D9D9D9"/>
-              <w:insideH w:val="single" w:sz="6" w:color="D9D9D9"/>
-              <w:insideV w:val="single" w:sz="6" w:color="D9D9D9"/>
-            </w:tcBorders>
-            <w:tcMar>
-              <w:top w:w="100" w:type="dxa"/>
-              <w:start w:w="120" w:type="dxa"/>
-              <w:bottom w:w="100" w:type="dxa"/>
-              <w:end w:w="120" w:type="dxa"/>
-            </w:tcMar>
-            <w:vAlign w:val="center"/>
-          </w:tcPr>
-          <w:p>
-            <w:pPr>
-              <w:jc w:val="left"/>
-            </w:pPr>
-            <w:r>
-              <w:rPr>
-                <w:sz w:val="16"/>
-              </w:rPr>
-              <w:t>観測残差に基づく品質指標へ変更</w:t>
-            </w:r>
-          </w:p>
-        </w:tc>
-      </w:tr>
     </w:tbl>
     <w:p>
       <w:pPr>
         <w:spacing w:after="40"/>
       </w:pPr>
-    </w:p>
-    <w:p>
-      <w:r>
-        <w:br w:type="page"/>
-      </w:r>
     </w:p>
     <w:p>
       <w:pPr>

</xml_diff>